<commit_message>
Impotar y Exportar ZIP listos
El sistema ya es capas de exportar la libreria y de importar la misma. Para hacerlo realizamos un script nuevo llamado 'ExportZIP.js'
Además de eso, arreglamos el detalle  del buscador, que al abrir un archivo de la libreria desde el mismo, todos los archivos los abria con el visor de pdf y no con el que le correspondia. Ahora ya lo hace de forma correcta y sin problema alguno.
</commit_message>
<xml_diff>
--- a/Anticithera_Tareas_v2.docx
+++ b/Anticithera_Tareas_v2.docx
@@ -6156,7 +6156,7 @@
           <w:p>
             <w:pPr>
               <w:rPr>
-                <w:highlight w:val="yellow"/>
+                <w:highlight w:val="red"/>
               </w:rPr>
             </w:pPr>
             <w:r>
@@ -6166,7 +6166,7 @@
                 <w:color w:val="2E75B6"/>
                 <w:sz w:val="18"/>
                 <w:szCs w:val="18"/>
-                <w:highlight w:val="yellow"/>
+                <w:highlight w:val="red"/>
               </w:rPr>
               <w:t>F2-12</w:t>
             </w:r>
@@ -6191,14 +6191,14 @@
           <w:p>
             <w:pPr>
               <w:rPr>
-                <w:highlight w:val="yellow"/>
-              </w:rPr>
-            </w:pPr>
-            <w:r>
-              <w:rPr>
-                <w:sz w:val="18"/>
-                <w:szCs w:val="18"/>
-                <w:highlight w:val="yellow"/>
+                <w:highlight w:val="red"/>
+              </w:rPr>
+            </w:pPr>
+            <w:r>
+              <w:rPr>
+                <w:sz w:val="18"/>
+                <w:szCs w:val="18"/>
+                <w:highlight w:val="red"/>
               </w:rPr>
               <w:t>Visor de presentaciones y hojas de cálculo</w:t>
             </w:r>
@@ -6223,15 +6223,15 @@
           <w:p>
             <w:pPr>
               <w:rPr>
-                <w:highlight w:val="yellow"/>
-              </w:rPr>
-            </w:pPr>
-            <w:r>
-              <w:rPr>
-                <w:color w:val="595959"/>
-                <w:sz w:val="18"/>
-                <w:szCs w:val="18"/>
-                <w:highlight w:val="yellow"/>
+                <w:highlight w:val="red"/>
+              </w:rPr>
+            </w:pPr>
+            <w:r>
+              <w:rPr>
+                <w:color w:val="595959"/>
+                <w:sz w:val="18"/>
+                <w:szCs w:val="18"/>
+                <w:highlight w:val="red"/>
               </w:rPr>
               <w:t>Renderizar .</w:t>
             </w:r>
@@ -6241,7 +6241,7 @@
                 <w:color w:val="595959"/>
                 <w:sz w:val="18"/>
                 <w:szCs w:val="18"/>
-                <w:highlight w:val="yellow"/>
+                <w:highlight w:val="red"/>
               </w:rPr>
               <w:t>pptx</w:t>
             </w:r>
@@ -6251,7 +6251,7 @@
                 <w:color w:val="595959"/>
                 <w:sz w:val="18"/>
                 <w:szCs w:val="18"/>
-                <w:highlight w:val="yellow"/>
+                <w:highlight w:val="red"/>
               </w:rPr>
               <w:t xml:space="preserve"> y .xlsx / hojas .</w:t>
             </w:r>
@@ -6261,7 +6261,7 @@
                 <w:color w:val="595959"/>
                 <w:sz w:val="18"/>
                 <w:szCs w:val="18"/>
-                <w:highlight w:val="yellow"/>
+                <w:highlight w:val="red"/>
               </w:rPr>
               <w:t>ods</w:t>
             </w:r>
@@ -6271,7 +6271,7 @@
                 <w:color w:val="595959"/>
                 <w:sz w:val="18"/>
                 <w:szCs w:val="18"/>
-                <w:highlight w:val="yellow"/>
+                <w:highlight w:val="red"/>
               </w:rPr>
               <w:t xml:space="preserve">. Soporte básico de visualización (no edición). Usar </w:t>
             </w:r>
@@ -6281,7 +6281,7 @@
                 <w:color w:val="595959"/>
                 <w:sz w:val="18"/>
                 <w:szCs w:val="18"/>
-                <w:highlight w:val="yellow"/>
+                <w:highlight w:val="red"/>
               </w:rPr>
               <w:t>SheetJS</w:t>
             </w:r>
@@ -6291,7 +6291,7 @@
                 <w:color w:val="595959"/>
                 <w:sz w:val="18"/>
                 <w:szCs w:val="18"/>
-                <w:highlight w:val="yellow"/>
+                <w:highlight w:val="red"/>
               </w:rPr>
               <w:t xml:space="preserve"> para hojas</w:t>
             </w:r>
@@ -6300,7 +6300,7 @@
                 <w:color w:val="595959"/>
                 <w:sz w:val="18"/>
                 <w:szCs w:val="18"/>
-                <w:highlight w:val="yellow"/>
+                <w:highlight w:val="red"/>
               </w:rPr>
               <w:t>, u otra cosa</w:t>
             </w:r>
@@ -6309,7 +6309,7 @@
                 <w:color w:val="595959"/>
                 <w:sz w:val="18"/>
                 <w:szCs w:val="18"/>
-                <w:highlight w:val="yellow"/>
+                <w:highlight w:val="red"/>
               </w:rPr>
               <w:t>.</w:t>
             </w:r>
@@ -6334,7 +6334,7 @@
           <w:p>
             <w:pPr>
               <w:rPr>
-                <w:highlight w:val="yellow"/>
+                <w:highlight w:val="red"/>
               </w:rPr>
             </w:pPr>
             <w:r>
@@ -6344,7 +6344,7 @@
                 <w:color w:val="595959"/>
                 <w:sz w:val="18"/>
                 <w:szCs w:val="18"/>
-                <w:highlight w:val="yellow"/>
+                <w:highlight w:val="red"/>
               </w:rPr>
               <w:t>F1-04</w:t>
             </w:r>
@@ -6877,7 +6877,7 @@
               <w:bottom w:val="single" w:sz="1" w:space="0" w:color="CCCCCC"/>
               <w:right w:val="single" w:sz="1" w:space="0" w:color="CCCCCC"/>
             </w:tcBorders>
-            <w:shd w:val="clear" w:color="auto" w:fill="FFC000"/>
+            <w:shd w:val="clear" w:color="auto" w:fill="4EA72E" w:themeFill="accent6"/>
             <w:tcMar>
               <w:top w:w="60" w:type="dxa"/>
               <w:left w:w="100" w:type="dxa"/>
@@ -6908,7 +6908,7 @@
               <w:bottom w:val="single" w:sz="1" w:space="0" w:color="CCCCCC"/>
               <w:right w:val="single" w:sz="1" w:space="0" w:color="CCCCCC"/>
             </w:tcBorders>
-            <w:shd w:val="clear" w:color="auto" w:fill="FFC000"/>
+            <w:shd w:val="clear" w:color="auto" w:fill="4EA72E" w:themeFill="accent6"/>
             <w:tcMar>
               <w:top w:w="60" w:type="dxa"/>
               <w:left w:w="100" w:type="dxa"/>
@@ -6951,7 +6951,7 @@
               <w:bottom w:val="single" w:sz="1" w:space="0" w:color="CCCCCC"/>
               <w:right w:val="single" w:sz="1" w:space="0" w:color="CCCCCC"/>
             </w:tcBorders>
-            <w:shd w:val="clear" w:color="auto" w:fill="FFC000"/>
+            <w:shd w:val="clear" w:color="auto" w:fill="4EA72E" w:themeFill="accent6"/>
             <w:tcMar>
               <w:top w:w="60" w:type="dxa"/>
               <w:left w:w="100" w:type="dxa"/>
@@ -7015,7 +7015,7 @@
               <w:bottom w:val="single" w:sz="1" w:space="0" w:color="CCCCCC"/>
               <w:right w:val="single" w:sz="1" w:space="0" w:color="CCCCCC"/>
             </w:tcBorders>
-            <w:shd w:val="clear" w:color="auto" w:fill="FFC000"/>
+            <w:shd w:val="clear" w:color="auto" w:fill="4EA72E" w:themeFill="accent6"/>
             <w:tcMar>
               <w:top w:w="60" w:type="dxa"/>
               <w:left w:w="100" w:type="dxa"/>
@@ -7047,7 +7047,7 @@
               <w:bottom w:val="single" w:sz="1" w:space="0" w:color="CCCCCC"/>
               <w:right w:val="single" w:sz="1" w:space="0" w:color="CCCCCC"/>
             </w:tcBorders>
-            <w:shd w:val="clear" w:color="auto" w:fill="FFC000"/>
+            <w:shd w:val="clear" w:color="auto" w:fill="4EA72E" w:themeFill="accent6"/>
             <w:tcMar>
               <w:top w:w="60" w:type="dxa"/>
               <w:left w:w="100" w:type="dxa"/>
@@ -7077,7 +7077,7 @@
               <w:bottom w:val="single" w:sz="1" w:space="0" w:color="CCCCCC"/>
               <w:right w:val="single" w:sz="1" w:space="0" w:color="CCCCCC"/>
             </w:tcBorders>
-            <w:shd w:val="clear" w:color="auto" w:fill="FFC000"/>
+            <w:shd w:val="clear" w:color="auto" w:fill="4EA72E" w:themeFill="accent6"/>
             <w:tcMar>
               <w:top w:w="60" w:type="dxa"/>
               <w:left w:w="100" w:type="dxa"/>
@@ -7113,7 +7113,7 @@
               <w:bottom w:val="single" w:sz="1" w:space="0" w:color="CCCCCC"/>
               <w:right w:val="single" w:sz="1" w:space="0" w:color="CCCCCC"/>
             </w:tcBorders>
-            <w:shd w:val="clear" w:color="auto" w:fill="FFC000"/>
+            <w:shd w:val="clear" w:color="auto" w:fill="4EA72E" w:themeFill="accent6"/>
             <w:tcMar>
               <w:top w:w="60" w:type="dxa"/>
               <w:left w:w="100" w:type="dxa"/>
@@ -7159,7 +7159,7 @@
               <w:bottom w:val="single" w:sz="1" w:space="0" w:color="CCCCCC"/>
               <w:right w:val="single" w:sz="1" w:space="0" w:color="CCCCCC"/>
             </w:tcBorders>
-            <w:shd w:val="clear" w:color="auto" w:fill="FFC000"/>
+            <w:shd w:val="clear" w:color="auto" w:fill="4EA72E" w:themeFill="accent6"/>
             <w:tcMar>
               <w:top w:w="60" w:type="dxa"/>
               <w:left w:w="100" w:type="dxa"/>
@@ -11725,7 +11725,7 @@
         </w:rPr>
         <w:lastRenderedPageBreak/>
         <w:drawing>
-          <wp:anchor distT="0" distB="0" distL="114300" distR="114300" simplePos="0" relativeHeight="251658240" behindDoc="0" locked="0" layoutInCell="1" allowOverlap="1" wp14:anchorId="25F25952" wp14:editId="521E9842">
+          <wp:anchor distT="0" distB="0" distL="114300" distR="114300" simplePos="0" relativeHeight="251658240" behindDoc="0" locked="0" layoutInCell="1" allowOverlap="1" wp14:anchorId="25F25952" wp14:editId="4149B69D">
             <wp:simplePos x="0" y="0"/>
             <wp:positionH relativeFrom="margin">
               <wp:align>right</wp:align>
@@ -11750,7 +11750,7 @@
                     </pic:cNvPicPr>
                   </pic:nvPicPr>
                   <pic:blipFill>
-                    <a:blip r:embed="rId5" cstate="print">
+                    <a:blip r:embed="rId6" cstate="print">
                       <a:extLst>
                         <a:ext uri="{28A0092B-C50C-407E-A947-70E740481C1C}">
                           <a14:useLocalDpi xmlns:a14="http://schemas.microsoft.com/office/drawing/2010/main" val="0"/>
@@ -12835,4 +12835,16 @@
     </a:ext>
   </a:extLst>
 </a:theme>
+</file>
+
+<file path=customXml/item1.xml><?xml version="1.0" encoding="utf-8"?>
+<b:Sources xmlns:b="http://schemas.openxmlformats.org/officeDocument/2006/bibliography" xmlns="http://schemas.openxmlformats.org/officeDocument/2006/bibliography" SelectedStyle="\APASixthEditionOfficeOnline.xsl" StyleName="APA" Version="6"/>
+</file>
+
+<file path=customXml/itemProps1.xml><?xml version="1.0" encoding="utf-8"?>
+<ds:datastoreItem xmlns:ds="http://schemas.openxmlformats.org/officeDocument/2006/customXml" ds:itemID="{6B31B129-D780-4033-B35F-894042CABAC2}">
+  <ds:schemaRefs>
+    <ds:schemaRef ds:uri="http://schemas.openxmlformats.org/officeDocument/2006/bibliography"/>
+  </ds:schemaRefs>
+</ds:datastoreItem>
 </file>
</xml_diff>